<commit_message>
update readme file for users
</commit_message>
<xml_diff>
--- a/examples/readme_for_E3SMv3_and_SCREAM_model_class_for_users.docx
+++ b/examples/readme_for_E3SMv3_and_SCREAM_model_class_for_users.docx
@@ -72,14 +72,14 @@
       <w:pPr>
         <w:jc w:val="center"/>
         <w:rPr>
-          <w:color w:val="ADADAD" w:themeColor="background2" w:themeShade="BF"/>
+          <w:color w:val="7F7F7F" w:themeColor="text1" w:themeTint="80"/>
           <w:sz w:val="32"/>
           <w:szCs w:val="32"/>
         </w:rPr>
       </w:pPr>
       <w:r>
         <w:rPr>
-          <w:color w:val="ADADAD" w:themeColor="background2" w:themeShade="BF"/>
+          <w:color w:val="7F7F7F" w:themeColor="text1" w:themeTint="80"/>
           <w:sz w:val="32"/>
           <w:szCs w:val="32"/>
         </w:rPr>
@@ -87,7 +87,7 @@
       </w:r>
       <w:r>
         <w:rPr>
-          <w:color w:val="ADADAD" w:themeColor="background2" w:themeShade="BF"/>
+          <w:color w:val="7F7F7F" w:themeColor="text1" w:themeTint="80"/>
           <w:sz w:val="32"/>
           <w:szCs w:val="32"/>
         </w:rPr>
@@ -95,7 +95,7 @@
       </w:r>
       <w:r>
         <w:rPr>
-          <w:color w:val="ADADAD" w:themeColor="background2" w:themeShade="BF"/>
+          <w:color w:val="7F7F7F" w:themeColor="text1" w:themeTint="80"/>
           <w:sz w:val="32"/>
           <w:szCs w:val="32"/>
         </w:rPr>
@@ -261,11 +261,17 @@
     <w:p>
       <w:pPr>
         <w:rPr>
-          <w:color w:val="ADADAD" w:themeColor="background2" w:themeShade="BF"/>
-        </w:rPr>
-      </w:pPr>
-      <w:r>
-        <w:t>Generate instrument class objects. In this example, HSRL and KAZR are used.</w:t>
+          <w:color w:val="7F7F7F" w:themeColor="text1" w:themeTint="80"/>
+        </w:rPr>
+      </w:pPr>
+      <w:r>
+        <w:t>Generate instrument class objects. In this example, HSRL and KAZR are used</w:t>
+      </w:r>
+      <w:r>
+        <w:rPr>
+          <w:color w:val="7F7F7F" w:themeColor="text1" w:themeTint="80"/>
+        </w:rPr>
+        <w:t>.</w:t>
       </w:r>
       <w:r>
         <w:rPr>
@@ -274,6 +280,7 @@
           <w:bCs/>
           <w:i/>
           <w:iCs/>
+          <w:color w:val="7F7F7F" w:themeColor="text1" w:themeTint="80"/>
           <w:kern w:val="0"/>
           <w14:ligatures w14:val="none"/>
         </w:rPr>
@@ -281,7 +288,7 @@
       </w:r>
       <w:r>
         <w:rPr>
-          <w:color w:val="ADADAD" w:themeColor="background2" w:themeShade="BF"/>
+          <w:color w:val="7F7F7F" w:themeColor="text1" w:themeTint="80"/>
         </w:rPr>
         <w:t>Among other radar and lidar instruments, EMC² includes instrument sub-classes for the full ARM radar and lidar instrument suite. Note that in the case of the KAZR class object (as in the case of different radar object) we specify the ARM site string to initialize the KAZR class object with the correct radar attributes.</w:t>
       </w:r>
@@ -352,7 +359,21 @@
         <w:t xml:space="preserve">for ARM sites </w:t>
       </w:r>
       <w:r>
-        <w:t>are listed in ./</w:t>
+        <w:t xml:space="preserve">are listed </w:t>
+      </w:r>
+      <w:proofErr w:type="gramStart"/>
+      <w:r>
+        <w:t>in</w:t>
+      </w:r>
+      <w:r>
+        <w:t xml:space="preserve"> </w:t>
+      </w:r>
+      <w:r>
+        <w:t>.</w:t>
+      </w:r>
+      <w:proofErr w:type="gramEnd"/>
+      <w:r>
+        <w:t>/</w:t>
       </w:r>
       <w:r>
         <w:t>EMC2/</w:t>
@@ -415,7 +436,15 @@
     <w:p/>
     <w:p>
       <w:r>
-        <w:t>Load data file using emc2.core.model.E3SMv3 object.</w:t>
+        <w:t xml:space="preserve">Load data file using </w:t>
+      </w:r>
+      <w:proofErr w:type="gramStart"/>
+      <w:r>
+        <w:t>emc2.core.model</w:t>
+      </w:r>
+      <w:proofErr w:type="gramEnd"/>
+      <w:r>
+        <w:t>.E3SMv3 object.</w:t>
       </w:r>
     </w:p>
     <w:p>
@@ -474,40 +503,40 @@
           <w:numId w:val="4"/>
         </w:numPr>
         <w:rPr>
-          <w:color w:val="ADADAD" w:themeColor="background2" w:themeShade="BF"/>
-        </w:rPr>
-      </w:pPr>
-      <w:r>
-        <w:rPr>
-          <w:color w:val="ADADAD" w:themeColor="background2" w:themeShade="BF"/>
+          <w:color w:val="7F7F7F" w:themeColor="text1" w:themeTint="80"/>
+        </w:rPr>
+      </w:pPr>
+      <w:r>
+        <w:rPr>
+          <w:color w:val="7F7F7F" w:themeColor="text1" w:themeTint="80"/>
         </w:rPr>
         <w:t xml:space="preserve">Because E3SM operates a cube-sphere grid, data is not provided in a strict </w:t>
       </w:r>
       <w:proofErr w:type="spellStart"/>
       <w:r>
         <w:rPr>
-          <w:color w:val="ADADAD" w:themeColor="background2" w:themeShade="BF"/>
+          <w:color w:val="7F7F7F" w:themeColor="text1" w:themeTint="80"/>
         </w:rPr>
         <w:t>lat-lon</w:t>
       </w:r>
       <w:proofErr w:type="spellEnd"/>
       <w:r>
         <w:rPr>
-          <w:color w:val="ADADAD" w:themeColor="background2" w:themeShade="BF"/>
+          <w:color w:val="7F7F7F" w:themeColor="text1" w:themeTint="80"/>
         </w:rPr>
         <w:t xml:space="preserve"> grid (two spatial dimensions) but rather on a column basis (one spatial dimension). We need to inform EMC² about that by setting </w:t>
       </w:r>
       <w:proofErr w:type="spellStart"/>
       <w:r>
         <w:rPr>
-          <w:color w:val="ADADAD" w:themeColor="background2" w:themeShade="BF"/>
+          <w:color w:val="7F7F7F" w:themeColor="text1" w:themeTint="80"/>
         </w:rPr>
         <w:t>all_appended_in_lat</w:t>
       </w:r>
       <w:proofErr w:type="spellEnd"/>
       <w:r>
         <w:rPr>
-          <w:color w:val="ADADAD" w:themeColor="background2" w:themeShade="BF"/>
+          <w:color w:val="7F7F7F" w:themeColor="text1" w:themeTint="80"/>
         </w:rPr>
         <w:t>=True.</w:t>
       </w:r>
@@ -519,26 +548,26 @@
           <w:numId w:val="4"/>
         </w:numPr>
         <w:rPr>
-          <w:color w:val="ADADAD" w:themeColor="background2" w:themeShade="BF"/>
-        </w:rPr>
-      </w:pPr>
-      <w:r>
-        <w:rPr>
-          <w:color w:val="ADADAD" w:themeColor="background2" w:themeShade="BF"/>
+          <w:color w:val="7F7F7F" w:themeColor="text1" w:themeTint="80"/>
+        </w:rPr>
+      </w:pPr>
+      <w:r>
+        <w:rPr>
+          <w:color w:val="7F7F7F" w:themeColor="text1" w:themeTint="80"/>
         </w:rPr>
         <w:t>The regional output file has appended strings at the end of every field name, the result of post-processing machinery. By setting </w:t>
       </w:r>
       <w:proofErr w:type="spellStart"/>
       <w:r>
         <w:rPr>
-          <w:color w:val="ADADAD" w:themeColor="background2" w:themeShade="BF"/>
+          <w:color w:val="7F7F7F" w:themeColor="text1" w:themeTint="80"/>
         </w:rPr>
         <w:t>appended_str</w:t>
       </w:r>
       <w:proofErr w:type="spellEnd"/>
       <w:r>
         <w:rPr>
-          <w:color w:val="ADADAD" w:themeColor="background2" w:themeShade="BF"/>
+          <w:color w:val="7F7F7F" w:themeColor="text1" w:themeTint="80"/>
         </w:rPr>
         <w:t>=True, EMC² can remove these strings by using one of EMC²'s internal methods invoked during initialization.</w:t>
       </w:r>
@@ -550,20 +579,20 @@
           <w:numId w:val="4"/>
         </w:numPr>
         <w:rPr>
-          <w:color w:val="ADADAD" w:themeColor="background2" w:themeShade="BF"/>
+          <w:color w:val="7F7F7F" w:themeColor="text1" w:themeTint="80"/>
         </w:rPr>
       </w:pPr>
       <w:proofErr w:type="spellStart"/>
       <w:r>
         <w:rPr>
-          <w:color w:val="ADADAD" w:themeColor="background2" w:themeShade="BF"/>
+          <w:color w:val="7F7F7F" w:themeColor="text1" w:themeTint="80"/>
         </w:rPr>
         <w:t>single_ice_class</w:t>
       </w:r>
       <w:proofErr w:type="spellEnd"/>
       <w:r>
         <w:rPr>
-          <w:color w:val="ADADAD" w:themeColor="background2" w:themeShade="BF"/>
+          <w:color w:val="7F7F7F" w:themeColor="text1" w:themeTint="80"/>
         </w:rPr>
         <w:t>: If True, assuming model microphysics incorporate a single ice class (e.g., in P3 implemented in E3SMv3).</w:t>
       </w:r>
@@ -575,13 +604,13 @@
           <w:numId w:val="4"/>
         </w:numPr>
         <w:rPr>
-          <w:color w:val="ADADAD" w:themeColor="background2" w:themeShade="BF"/>
+          <w:color w:val="7F7F7F" w:themeColor="text1" w:themeTint="80"/>
         </w:rPr>
       </w:pPr>
       <w:proofErr w:type="spellStart"/>
       <w:r>
         <w:rPr>
-          <w:color w:val="ADADAD" w:themeColor="background2" w:themeShade="BF"/>
+          <w:color w:val="7F7F7F" w:themeColor="text1" w:themeTint="80"/>
         </w:rPr>
         <w:lastRenderedPageBreak/>
         <w:t>include_rain_in_rt</w:t>
@@ -589,33 +618,9 @@
       <w:proofErr w:type="spellEnd"/>
       <w:r>
         <w:rPr>
-          <w:color w:val="ADADAD" w:themeColor="background2" w:themeShade="BF"/>
-        </w:rPr>
-        <w:t>: If True, including the rain class (`pl`) in the forward calculations.</w:t>
-      </w:r>
-      <w:r>
-        <w:rPr>
-          <w:color w:val="ADADAD" w:themeColor="background2" w:themeShade="BF"/>
-        </w:rPr>
-        <w:t xml:space="preserve"> </w:t>
-      </w:r>
-      <w:r>
-        <w:rPr>
-          <w:color w:val="ADADAD" w:themeColor="background2" w:themeShade="BF"/>
-        </w:rPr>
-        <w:t>By default, set to False given that the rain class is excluded from the E3SM radiative scheme</w:t>
-      </w:r>
-      <w:r>
-        <w:rPr>
-          <w:color w:val="ADADAD" w:themeColor="background2" w:themeShade="BF"/>
-        </w:rPr>
-        <w:t xml:space="preserve"> </w:t>
-      </w:r>
-      <w:r>
-        <w:rPr>
-          <w:color w:val="ADADAD" w:themeColor="background2" w:themeShade="BF"/>
-        </w:rPr>
-        <w:t>calculations.</w:t>
+          <w:color w:val="7F7F7F" w:themeColor="text1" w:themeTint="80"/>
+        </w:rPr>
+        <w:t>: If True, including the rain class (`pl`) in the forward calculations. By default, set to False given that the rain class is excluded from the E3SM radiative scheme calculations.</w:t>
       </w:r>
     </w:p>
     <w:p/>
@@ -686,40 +691,38 @@
           <w:numId w:val="5"/>
         </w:numPr>
         <w:rPr>
-          <w:color w:val="ADADAD" w:themeColor="background2" w:themeShade="BF"/>
-        </w:rPr>
-      </w:pPr>
-      <w:r>
-        <w:rPr>
-          <w:color w:val="ADADAD" w:themeColor="background2" w:themeShade="BF"/>
-        </w:rPr>
-        <w:t xml:space="preserve">Note that because the model output contains the spatial dimension stacked onto the time dimension, we wish to unstack these dimensions once all </w:t>
+          <w:color w:val="7F7F7F" w:themeColor="text1" w:themeTint="80"/>
+        </w:rPr>
+      </w:pPr>
+      <w:r>
+        <w:rPr>
+          <w:color w:val="7F7F7F" w:themeColor="text1" w:themeTint="80"/>
+        </w:rPr>
+        <w:t>Note that because the model output contains the spatial dimension stacked onto the time dimension, we wish to unstack these dimensions once all simu</w:t>
+      </w:r>
+      <w:r>
+        <w:rPr>
+          <w:color w:val="7F7F7F" w:themeColor="text1" w:themeTint="80"/>
+        </w:rPr>
+        <w:t>l</w:t>
+      </w:r>
+      <w:r>
+        <w:rPr>
+          <w:color w:val="7F7F7F" w:themeColor="text1" w:themeTint="80"/>
+        </w:rPr>
+        <w:t>ator operations are done by setting </w:t>
       </w:r>
       <w:proofErr w:type="spellStart"/>
       <w:r>
         <w:rPr>
-          <w:color w:val="ADADAD" w:themeColor="background2" w:themeShade="BF"/>
-        </w:rPr>
-        <w:t>simualtor</w:t>
+          <w:color w:val="7F7F7F" w:themeColor="text1" w:themeTint="80"/>
+        </w:rPr>
+        <w:t>unstack_dims</w:t>
       </w:r>
       <w:proofErr w:type="spellEnd"/>
       <w:r>
         <w:rPr>
-          <w:color w:val="ADADAD" w:themeColor="background2" w:themeShade="BF"/>
-        </w:rPr>
-        <w:t xml:space="preserve"> operations are done by setting </w:t>
-      </w:r>
-      <w:proofErr w:type="spellStart"/>
-      <w:r>
-        <w:rPr>
-          <w:color w:val="ADADAD" w:themeColor="background2" w:themeShade="BF"/>
-        </w:rPr>
-        <w:t>unstack_dims</w:t>
-      </w:r>
-      <w:proofErr w:type="spellEnd"/>
-      <w:r>
-        <w:rPr>
-          <w:color w:val="ADADAD" w:themeColor="background2" w:themeShade="BF"/>
+          <w:color w:val="7F7F7F" w:themeColor="text1" w:themeTint="80"/>
         </w:rPr>
         <w:t>=True.</w:t>
       </w:r>
@@ -1241,49 +1244,109 @@
         <w:t>git checkout mengzhang-emc2-scream</w:t>
       </w:r>
     </w:p>
-    <w:p/>
-    <w:p>
-      <w:r>
-        <w:t xml:space="preserve">The demo data and </w:t>
-      </w:r>
-      <w:proofErr w:type="spellStart"/>
-      <w:r>
-        <w:t>Jupyter</w:t>
-      </w:r>
-      <w:proofErr w:type="spellEnd"/>
-      <w:r>
-        <w:t xml:space="preserve"> notebook to demonstrate the usage of this new model class is at .</w:t>
-      </w:r>
-      <w:r>
+    <w:p>
+      <w:pPr>
         <w:rPr>
           <w:i/>
           <w:iCs/>
         </w:rPr>
-        <w:t>/</w:t>
-      </w:r>
-      <w:r>
+      </w:pPr>
+    </w:p>
+    <w:p>
+      <w:r>
+        <w:t>To install the emc2 version from this branch</w:t>
+      </w:r>
+      <w:r>
+        <w:t xml:space="preserve"> in your CONDA ENVIRONMENT</w:t>
+      </w:r>
+    </w:p>
+    <w:p>
+      <w:pPr>
         <w:rPr>
           <w:i/>
           <w:iCs/>
         </w:rPr>
-        <w:t>examples/example_data/scream_dp_comble_anx.2020-03-01.demo.nc</w:t>
-      </w:r>
-      <w:r>
-        <w:t xml:space="preserve"> and .</w:t>
-      </w:r>
+      </w:pPr>
       <w:r>
         <w:rPr>
           <w:i/>
           <w:iCs/>
         </w:rPr>
+        <w:t>&gt;</w:t>
+      </w:r>
+      <w:r>
+        <w:rPr>
+          <w:i/>
+          <w:iCs/>
+        </w:rPr>
+        <w:t xml:space="preserve"> cd EMC2</w:t>
+      </w:r>
+    </w:p>
+    <w:p>
+      <w:pPr>
+        <w:rPr>
+          <w:i/>
+          <w:iCs/>
+        </w:rPr>
+      </w:pPr>
+      <w:r>
+        <w:rPr>
+          <w:i/>
+          <w:iCs/>
+        </w:rPr>
+        <w:t xml:space="preserve">&gt; pip </w:t>
+      </w:r>
+      <w:proofErr w:type="gramStart"/>
+      <w:r>
+        <w:rPr>
+          <w:i/>
+          <w:iCs/>
+        </w:rPr>
+        <w:t>install .</w:t>
+      </w:r>
+      <w:proofErr w:type="gramEnd"/>
+    </w:p>
+    <w:p/>
+    <w:p>
+      <w:r>
+        <w:t xml:space="preserve">The demo data and </w:t>
+      </w:r>
+      <w:proofErr w:type="spellStart"/>
+      <w:r>
+        <w:t>Jupyter</w:t>
+      </w:r>
+      <w:proofErr w:type="spellEnd"/>
+      <w:r>
+        <w:t xml:space="preserve"> notebook to demonstrate the usage of this new model class is at .</w:t>
+      </w:r>
+      <w:r>
+        <w:rPr>
+          <w:i/>
+          <w:iCs/>
+        </w:rPr>
+        <w:t>/</w:t>
+      </w:r>
+      <w:r>
+        <w:rPr>
+          <w:i/>
+          <w:iCs/>
+        </w:rPr>
+        <w:t>examples/example_data/scream_dp_comble_anx.2020-03-01.demo.nc</w:t>
+      </w:r>
+      <w:r>
+        <w:t xml:space="preserve"> and .</w:t>
+      </w:r>
+      <w:r>
+        <w:rPr>
+          <w:i/>
+          <w:iCs/>
+        </w:rPr>
         <w:t>/examples/Test_EMC2_demo_w_SCREAM.ipynb</w:t>
       </w:r>
       <w:r>
         <w:t>.</w:t>
       </w:r>
     </w:p>
-    <w:p/>
-    <w:p/>
     <w:p/>
     <w:p>
       <w:r>
@@ -1426,7 +1489,15 @@
     <w:p/>
     <w:p>
       <w:r>
-        <w:t>Load data file using emc2.core.model.SCREAM object.</w:t>
+        <w:t xml:space="preserve">Load data file using </w:t>
+      </w:r>
+      <w:proofErr w:type="gramStart"/>
+      <w:r>
+        <w:t>emc2.core.model</w:t>
+      </w:r>
+      <w:proofErr w:type="gramEnd"/>
+      <w:r>
+        <w:t>.SCREAM object.</w:t>
       </w:r>
     </w:p>
     <w:p>
@@ -1434,6 +1505,7 @@
         <w:rPr>
           <w:noProof/>
         </w:rPr>
+        <w:lastRenderedPageBreak/>
         <w:drawing>
           <wp:inline distT="0" distB="0" distL="0" distR="0" wp14:anchorId="7404C571" wp14:editId="76177C34">
             <wp:extent cx="5943600" cy="340360"/>
@@ -1710,6 +1782,119 @@
     </w:lvl>
   </w:abstractNum>
   <w:abstractNum w:abstractNumId="1" w15:restartNumberingAfterBreak="0">
+    <w:nsid w:val="23A5312C"/>
+    <w:multiLevelType w:val="hybridMultilevel"/>
+    <w:tmpl w:val="19AA110C"/>
+    <w:lvl w:ilvl="0" w:tplc="121403FC">
+      <w:start w:val="1050"/>
+      <w:numFmt w:val="bullet"/>
+      <w:lvlText w:val=""/>
+      <w:lvlJc w:val="left"/>
+      <w:pPr>
+        <w:ind w:left="720" w:hanging="360"/>
+      </w:pPr>
+      <w:rPr>
+        <w:rFonts w:ascii="Wingdings" w:eastAsiaTheme="minorHAnsi" w:hAnsi="Wingdings" w:cstheme="minorBidi" w:hint="default"/>
+      </w:rPr>
+    </w:lvl>
+    <w:lvl w:ilvl="1" w:tplc="04090003" w:tentative="1">
+      <w:start w:val="1"/>
+      <w:numFmt w:val="bullet"/>
+      <w:lvlText w:val="o"/>
+      <w:lvlJc w:val="left"/>
+      <w:pPr>
+        <w:ind w:left="1440" w:hanging="360"/>
+      </w:pPr>
+      <w:rPr>
+        <w:rFonts w:ascii="Courier New" w:hAnsi="Courier New" w:cs="Courier New" w:hint="default"/>
+      </w:rPr>
+    </w:lvl>
+    <w:lvl w:ilvl="2" w:tplc="04090005" w:tentative="1">
+      <w:start w:val="1"/>
+      <w:numFmt w:val="bullet"/>
+      <w:lvlText w:val=""/>
+      <w:lvlJc w:val="left"/>
+      <w:pPr>
+        <w:ind w:left="2160" w:hanging="360"/>
+      </w:pPr>
+      <w:rPr>
+        <w:rFonts w:ascii="Wingdings" w:hAnsi="Wingdings" w:hint="default"/>
+      </w:rPr>
+    </w:lvl>
+    <w:lvl w:ilvl="3" w:tplc="04090001" w:tentative="1">
+      <w:start w:val="1"/>
+      <w:numFmt w:val="bullet"/>
+      <w:lvlText w:val=""/>
+      <w:lvlJc w:val="left"/>
+      <w:pPr>
+        <w:ind w:left="2880" w:hanging="360"/>
+      </w:pPr>
+      <w:rPr>
+        <w:rFonts w:ascii="Symbol" w:hAnsi="Symbol" w:hint="default"/>
+      </w:rPr>
+    </w:lvl>
+    <w:lvl w:ilvl="4" w:tplc="04090003" w:tentative="1">
+      <w:start w:val="1"/>
+      <w:numFmt w:val="bullet"/>
+      <w:lvlText w:val="o"/>
+      <w:lvlJc w:val="left"/>
+      <w:pPr>
+        <w:ind w:left="3600" w:hanging="360"/>
+      </w:pPr>
+      <w:rPr>
+        <w:rFonts w:ascii="Courier New" w:hAnsi="Courier New" w:cs="Courier New" w:hint="default"/>
+      </w:rPr>
+    </w:lvl>
+    <w:lvl w:ilvl="5" w:tplc="04090005" w:tentative="1">
+      <w:start w:val="1"/>
+      <w:numFmt w:val="bullet"/>
+      <w:lvlText w:val=""/>
+      <w:lvlJc w:val="left"/>
+      <w:pPr>
+        <w:ind w:left="4320" w:hanging="360"/>
+      </w:pPr>
+      <w:rPr>
+        <w:rFonts w:ascii="Wingdings" w:hAnsi="Wingdings" w:hint="default"/>
+      </w:rPr>
+    </w:lvl>
+    <w:lvl w:ilvl="6" w:tplc="04090001" w:tentative="1">
+      <w:start w:val="1"/>
+      <w:numFmt w:val="bullet"/>
+      <w:lvlText w:val=""/>
+      <w:lvlJc w:val="left"/>
+      <w:pPr>
+        <w:ind w:left="5040" w:hanging="360"/>
+      </w:pPr>
+      <w:rPr>
+        <w:rFonts w:ascii="Symbol" w:hAnsi="Symbol" w:hint="default"/>
+      </w:rPr>
+    </w:lvl>
+    <w:lvl w:ilvl="7" w:tplc="04090003" w:tentative="1">
+      <w:start w:val="1"/>
+      <w:numFmt w:val="bullet"/>
+      <w:lvlText w:val="o"/>
+      <w:lvlJc w:val="left"/>
+      <w:pPr>
+        <w:ind w:left="5760" w:hanging="360"/>
+      </w:pPr>
+      <w:rPr>
+        <w:rFonts w:ascii="Courier New" w:hAnsi="Courier New" w:cs="Courier New" w:hint="default"/>
+      </w:rPr>
+    </w:lvl>
+    <w:lvl w:ilvl="8" w:tplc="04090005" w:tentative="1">
+      <w:start w:val="1"/>
+      <w:numFmt w:val="bullet"/>
+      <w:lvlText w:val=""/>
+      <w:lvlJc w:val="left"/>
+      <w:pPr>
+        <w:ind w:left="6480" w:hanging="360"/>
+      </w:pPr>
+      <w:rPr>
+        <w:rFonts w:ascii="Wingdings" w:hAnsi="Wingdings" w:hint="default"/>
+      </w:rPr>
+    </w:lvl>
+  </w:abstractNum>
+  <w:abstractNum w:abstractNumId="2" w15:restartNumberingAfterBreak="0">
     <w:nsid w:val="2B1F0F9E"/>
     <w:multiLevelType w:val="hybridMultilevel"/>
     <w:tmpl w:val="791CBD16"/>
@@ -1822,7 +2007,120 @@
       </w:rPr>
     </w:lvl>
   </w:abstractNum>
-  <w:abstractNum w:abstractNumId="2" w15:restartNumberingAfterBreak="0">
+  <w:abstractNum w:abstractNumId="3" w15:restartNumberingAfterBreak="0">
+    <w:nsid w:val="33620677"/>
+    <w:multiLevelType w:val="hybridMultilevel"/>
+    <w:tmpl w:val="96C6B65E"/>
+    <w:lvl w:ilvl="0" w:tplc="FF9A5866">
+      <w:start w:val="1050"/>
+      <w:numFmt w:val="bullet"/>
+      <w:lvlText w:val=""/>
+      <w:lvlJc w:val="left"/>
+      <w:pPr>
+        <w:ind w:left="720" w:hanging="360"/>
+      </w:pPr>
+      <w:rPr>
+        <w:rFonts w:ascii="Wingdings" w:eastAsiaTheme="minorHAnsi" w:hAnsi="Wingdings" w:cstheme="minorBidi" w:hint="default"/>
+      </w:rPr>
+    </w:lvl>
+    <w:lvl w:ilvl="1" w:tplc="04090003" w:tentative="1">
+      <w:start w:val="1"/>
+      <w:numFmt w:val="bullet"/>
+      <w:lvlText w:val="o"/>
+      <w:lvlJc w:val="left"/>
+      <w:pPr>
+        <w:ind w:left="1440" w:hanging="360"/>
+      </w:pPr>
+      <w:rPr>
+        <w:rFonts w:ascii="Courier New" w:hAnsi="Courier New" w:cs="Courier New" w:hint="default"/>
+      </w:rPr>
+    </w:lvl>
+    <w:lvl w:ilvl="2" w:tplc="04090005" w:tentative="1">
+      <w:start w:val="1"/>
+      <w:numFmt w:val="bullet"/>
+      <w:lvlText w:val=""/>
+      <w:lvlJc w:val="left"/>
+      <w:pPr>
+        <w:ind w:left="2160" w:hanging="360"/>
+      </w:pPr>
+      <w:rPr>
+        <w:rFonts w:ascii="Wingdings" w:hAnsi="Wingdings" w:hint="default"/>
+      </w:rPr>
+    </w:lvl>
+    <w:lvl w:ilvl="3" w:tplc="04090001" w:tentative="1">
+      <w:start w:val="1"/>
+      <w:numFmt w:val="bullet"/>
+      <w:lvlText w:val=""/>
+      <w:lvlJc w:val="left"/>
+      <w:pPr>
+        <w:ind w:left="2880" w:hanging="360"/>
+      </w:pPr>
+      <w:rPr>
+        <w:rFonts w:ascii="Symbol" w:hAnsi="Symbol" w:hint="default"/>
+      </w:rPr>
+    </w:lvl>
+    <w:lvl w:ilvl="4" w:tplc="04090003" w:tentative="1">
+      <w:start w:val="1"/>
+      <w:numFmt w:val="bullet"/>
+      <w:lvlText w:val="o"/>
+      <w:lvlJc w:val="left"/>
+      <w:pPr>
+        <w:ind w:left="3600" w:hanging="360"/>
+      </w:pPr>
+      <w:rPr>
+        <w:rFonts w:ascii="Courier New" w:hAnsi="Courier New" w:cs="Courier New" w:hint="default"/>
+      </w:rPr>
+    </w:lvl>
+    <w:lvl w:ilvl="5" w:tplc="04090005" w:tentative="1">
+      <w:start w:val="1"/>
+      <w:numFmt w:val="bullet"/>
+      <w:lvlText w:val=""/>
+      <w:lvlJc w:val="left"/>
+      <w:pPr>
+        <w:ind w:left="4320" w:hanging="360"/>
+      </w:pPr>
+      <w:rPr>
+        <w:rFonts w:ascii="Wingdings" w:hAnsi="Wingdings" w:hint="default"/>
+      </w:rPr>
+    </w:lvl>
+    <w:lvl w:ilvl="6" w:tplc="04090001" w:tentative="1">
+      <w:start w:val="1"/>
+      <w:numFmt w:val="bullet"/>
+      <w:lvlText w:val=""/>
+      <w:lvlJc w:val="left"/>
+      <w:pPr>
+        <w:ind w:left="5040" w:hanging="360"/>
+      </w:pPr>
+      <w:rPr>
+        <w:rFonts w:ascii="Symbol" w:hAnsi="Symbol" w:hint="default"/>
+      </w:rPr>
+    </w:lvl>
+    <w:lvl w:ilvl="7" w:tplc="04090003" w:tentative="1">
+      <w:start w:val="1"/>
+      <w:numFmt w:val="bullet"/>
+      <w:lvlText w:val="o"/>
+      <w:lvlJc w:val="left"/>
+      <w:pPr>
+        <w:ind w:left="5760" w:hanging="360"/>
+      </w:pPr>
+      <w:rPr>
+        <w:rFonts w:ascii="Courier New" w:hAnsi="Courier New" w:cs="Courier New" w:hint="default"/>
+      </w:rPr>
+    </w:lvl>
+    <w:lvl w:ilvl="8" w:tplc="04090005" w:tentative="1">
+      <w:start w:val="1"/>
+      <w:numFmt w:val="bullet"/>
+      <w:lvlText w:val=""/>
+      <w:lvlJc w:val="left"/>
+      <w:pPr>
+        <w:ind w:left="6480" w:hanging="360"/>
+      </w:pPr>
+      <w:rPr>
+        <w:rFonts w:ascii="Wingdings" w:hAnsi="Wingdings" w:hint="default"/>
+      </w:rPr>
+    </w:lvl>
+  </w:abstractNum>
+  <w:abstractNum w:abstractNumId="4" w15:restartNumberingAfterBreak="0">
     <w:nsid w:val="39D44540"/>
     <w:multiLevelType w:val="multilevel"/>
     <w:tmpl w:val="A5E616B6"/>
@@ -1935,7 +2233,7 @@
       </w:pPr>
     </w:lvl>
   </w:abstractNum>
-  <w:abstractNum w:abstractNumId="3" w15:restartNumberingAfterBreak="0">
+  <w:abstractNum w:abstractNumId="5" w15:restartNumberingAfterBreak="0">
     <w:nsid w:val="3C53010D"/>
     <w:multiLevelType w:val="hybridMultilevel"/>
     <w:tmpl w:val="7722D640"/>
@@ -2048,7 +2346,7 @@
       </w:rPr>
     </w:lvl>
   </w:abstractNum>
-  <w:abstractNum w:abstractNumId="4" w15:restartNumberingAfterBreak="0">
+  <w:abstractNum w:abstractNumId="6" w15:restartNumberingAfterBreak="0">
     <w:nsid w:val="3D396D6F"/>
     <w:multiLevelType w:val="hybridMultilevel"/>
     <w:tmpl w:val="F64A11F6"/>
@@ -2161,7 +2459,7 @@
       </w:rPr>
     </w:lvl>
   </w:abstractNum>
-  <w:abstractNum w:abstractNumId="5" w15:restartNumberingAfterBreak="0">
+  <w:abstractNum w:abstractNumId="7" w15:restartNumberingAfterBreak="0">
     <w:nsid w:val="45906C17"/>
     <w:multiLevelType w:val="multilevel"/>
     <w:tmpl w:val="A5E616B6"/>
@@ -2274,7 +2572,7 @@
       </w:pPr>
     </w:lvl>
   </w:abstractNum>
-  <w:abstractNum w:abstractNumId="6" w15:restartNumberingAfterBreak="0">
+  <w:abstractNum w:abstractNumId="8" w15:restartNumberingAfterBreak="0">
     <w:nsid w:val="7030395E"/>
     <w:multiLevelType w:val="hybridMultilevel"/>
     <w:tmpl w:val="FF7CCA52"/>
@@ -2388,25 +2686,31 @@
     </w:lvl>
   </w:abstractNum>
   <w:num w:numId="1" w16cid:durableId="1463310257">
-    <w:abstractNumId w:val="6"/>
+    <w:abstractNumId w:val="8"/>
   </w:num>
   <w:num w:numId="2" w16cid:durableId="439301381">
-    <w:abstractNumId w:val="4"/>
+    <w:abstractNumId w:val="6"/>
   </w:num>
   <w:num w:numId="3" w16cid:durableId="1496188583">
     <w:abstractNumId w:val="0"/>
   </w:num>
   <w:num w:numId="4" w16cid:durableId="1775858667">
+    <w:abstractNumId w:val="4"/>
+  </w:num>
+  <w:num w:numId="5" w16cid:durableId="891313513">
+    <w:abstractNumId w:val="7"/>
+  </w:num>
+  <w:num w:numId="6" w16cid:durableId="2097551041">
     <w:abstractNumId w:val="2"/>
   </w:num>
-  <w:num w:numId="5" w16cid:durableId="891313513">
+  <w:num w:numId="7" w16cid:durableId="1996446979">
     <w:abstractNumId w:val="5"/>
   </w:num>
-  <w:num w:numId="6" w16cid:durableId="2097551041">
+  <w:num w:numId="8" w16cid:durableId="1877691887">
+    <w:abstractNumId w:val="3"/>
+  </w:num>
+  <w:num w:numId="9" w16cid:durableId="1021665609">
     <w:abstractNumId w:val="1"/>
-  </w:num>
-  <w:num w:numId="7" w16cid:durableId="1996446979">
-    <w:abstractNumId w:val="3"/>
   </w:num>
 </w:numbering>
 </file>
@@ -3342,6 +3646,18 @@
       <w:color w:val="666666"/>
     </w:rPr>
   </w:style>
+  <w:style w:type="character" w:styleId="FollowedHyperlink">
+    <w:name w:val="FollowedHyperlink"/>
+    <w:basedOn w:val="DefaultParagraphFont"/>
+    <w:uiPriority w:val="99"/>
+    <w:semiHidden/>
+    <w:unhideWhenUsed/>
+    <w:rsid w:val="008D6D4F"/>
+    <w:rPr>
+      <w:color w:val="96607D" w:themeColor="followedHyperlink"/>
+      <w:u w:val="single"/>
+    </w:rPr>
+  </w:style>
 </w:styles>
 </file>
 

</xml_diff>